<commit_message>
docs(ops): SOP v0.4 — 보험사 GOP 정산 리스크 대응(§6.10)
이대서울 국제의료사업팀 미팅 후 PO 제기: 보험사가 GOP 보내놓고 정산
지연·부분지급하는 리스크. 대응 원칙 — 환자 재정책임 백스톱 / GOP 상세화
/ 사전승인 / 고액 단계화 / 수수료-보험정산 분리 / 신뢰등급·파일럿 /
이대서울 IPD 프로세스 정렬. 병원 대납 약속 금지 명시.

Co-Authored-By: Claude Opus 4.8 <noreply@anthropic.com>
Claude-Session: https://claude.ai/code/session_01ChKqBZsKrKLhVBQXNNvzpX
</commit_message>
<xml_diff>
--- a/coo/04-operations/실환자_운영_SOP_초안.docx
+++ b/coo/04-operations/실환자_운영_SOP_초안.docx
@@ -11,7 +11,7 @@
         <w:rPr>
           <w:rFonts w:ascii="맑은 고딕" w:cs="맑은 고딕" w:eastAsia="맑은 고딕" w:hAnsi="맑은 고딕"/>
         </w:rPr>
-        <w:t xml:space="preserve">실환자 운영 실무 가이드라인 (Patient Journey SOP) — v0.3 초안</w:t>
+        <w:t xml:space="preserve">실환자 운영 실무 가이드라인 (Patient Journey SOP) — v0.4 초안</w:t>
       </w:r>
     </w:p>
     <w:p>
@@ -33,7 +33,7 @@
           <w:iCs w:val="false"/>
           <w:rFonts w:ascii="맑은 고딕" w:cs="맑은 고딕" w:eastAsia="맑은 고딕" w:hAnsi="맑은 고딕"/>
         </w:rPr>
-        <w:t xml:space="preserve">상태: v0.3 초안 · PO 교정 대기 · 실환자 받기 前 "가설 지도".</w:t>
+        <w:t xml:space="preserve">상태: v0.4 초안 · PO 교정 대기 · 실환자 받기 前 "가설 지도".</w:t>
       </w:r>
     </w:p>
     <w:p>
@@ -9298,6 +9298,417 @@
     </w:p>
     <w:p>
       <w:pPr>
+        <w:pStyle w:val="Heading2"/>
+        <w:spacing w:before="200" w:after="100"/>
+      </w:pPr>
+      <w:r>
+        <w:rPr>
+          <w:rFonts w:ascii="맑은 고딕" w:cs="맑은 고딕" w:eastAsia="맑은 고딕" w:hAnsi="맑은 고딕"/>
+        </w:rPr>
+        <w:t xml:space="preserve">6.10 🏦 보험사 GOP·정산 리스크 (보험 케이스 전용)</w:t>
+      </w:r>
+    </w:p>
+    <w:p>
+      <w:pPr>
+        <w:shd w:fill="F3F6F9" w:val="clear"/>
+        <w:spacing w:after="40"/>
+        <w:ind w:left="120"/>
+      </w:pPr>
+      <w:r>
+        <w:rPr>
+          <w:b/>
+          <w:bCs/>
+          <w:i w:val="false"/>
+          <w:iCs w:val="false"/>
+          <w:rFonts w:ascii="맑은 고딕" w:cs="맑은 고딕" w:eastAsia="맑은 고딕" w:hAnsi="맑은 고딕"/>
+        </w:rPr>
+        <w:t xml:space="preserve">문제</w:t>
+      </w:r>
+      <w:r>
+        <w:rPr>
+          <w:i w:val="false"/>
+          <w:iCs w:val="false"/>
+          <w:rFonts w:ascii="맑은 고딕" w:cs="맑은 고딕" w:eastAsia="맑은 고딕" w:hAnsi="맑은 고딕"/>
+        </w:rPr>
+        <w:t xml:space="preserve">: 보험사가 GOP(지불보증서, Guarantee of Payment)를 보내놓고도 "이 핑계 저 핑계"로 정산을 지연·부분지급하는 케이스가 실재(국제의료관광 최다 함정). 러시아 보험사는 제재·송금 리스크까지 겹침.</w:t>
+      </w:r>
+    </w:p>
+    <w:p>
+      <w:pPr>
+        <w:shd w:fill="F3F6F9" w:val="clear"/>
+        <w:spacing w:after="40"/>
+        <w:ind w:left="120"/>
+      </w:pPr>
+      <w:r>
+        <w:rPr>
+          <w:b/>
+          <w:bCs/>
+          <w:i w:val="false"/>
+          <w:iCs w:val="false"/>
+          <w:rFonts w:ascii="맑은 고딕" w:cs="맑은 고딕" w:eastAsia="맑은 고딕" w:hAnsi="맑은 고딕"/>
+        </w:rPr>
+        <w:t xml:space="preserve">핵심 원칙</w:t>
+      </w:r>
+      <w:r>
+        <w:rPr>
+          <w:i w:val="false"/>
+          <w:iCs w:val="false"/>
+          <w:rFonts w:ascii="맑은 고딕" w:cs="맑은 고딕" w:eastAsia="맑은 고딕" w:hAnsi="맑은 고딕"/>
+        </w:rPr>
+        <w:t xml:space="preserve">: 보험사한테 담보를 요구(계약 파탄)하는 대신 </w:t>
+      </w:r>
+      <w:r>
+        <w:rPr>
+          <w:b/>
+          <w:bCs/>
+          <w:i w:val="false"/>
+          <w:iCs w:val="false"/>
+          <w:rFonts w:ascii="맑은 고딕" w:cs="맑은 고딕" w:eastAsia="맑은 고딕" w:hAnsi="맑은 고딕"/>
+        </w:rPr>
+        <w:t xml:space="preserve">① 환자를 최종 백스톱으로 ② GOP를 조이고 ③ 우리 현금흐름을 보험사 정산과 분리</w:t>
+      </w:r>
+      <w:r>
+        <w:rPr>
+          <w:i w:val="false"/>
+          <w:iCs w:val="false"/>
+          <w:rFonts w:ascii="맑은 고딕" w:cs="맑은 고딕" w:eastAsia="맑은 고딕" w:hAnsi="맑은 고딕"/>
+        </w:rPr>
+        <w:t xml:space="preserve">한다. </w:t>
+      </w:r>
+      <w:r>
+        <w:rPr>
+          <w:b/>
+          <w:bCs/>
+          <w:i w:val="false"/>
+          <w:iCs w:val="false"/>
+          <w:rFonts w:ascii="맑은 고딕" w:cs="맑은 고딕" w:eastAsia="맑은 고딕" w:hAnsi="맑은 고딕"/>
+        </w:rPr>
+        <w:t xml:space="preserve">병원엔 "보험사 미지급 시 우리가 대납" 약속 절대 금지</w:t>
+      </w:r>
+      <w:r>
+        <w:rPr>
+          <w:i w:val="false"/>
+          <w:iCs w:val="false"/>
+          <w:rFonts w:ascii="맑은 고딕" w:cs="맑은 고딕" w:eastAsia="맑은 고딕" w:hAnsi="맑은 고딕"/>
+        </w:rPr>
+        <w:t xml:space="preserve">(솔로 유치업자 감당 불가).</w:t>
+      </w:r>
+    </w:p>
+    <w:p>
+      <w:pPr>
+        <w:spacing w:after="40"/>
+      </w:pPr>
+    </w:p>
+    <w:p>
+      <w:pPr>
+        <w:spacing w:after="20"/>
+      </w:pPr>
+      <w:r>
+        <w:rPr>
+          <w:rFonts w:ascii="맑은 고딕" w:cs="맑은 고딕" w:eastAsia="맑은 고딕" w:hAnsi="맑은 고딕"/>
+        </w:rPr>
+        <w:t xml:space="preserve">1. </w:t>
+      </w:r>
+      <w:r>
+        <w:rPr>
+          <w:b/>
+          <w:bCs/>
+          <w:rFonts w:ascii="맑은 고딕" w:cs="맑은 고딕" w:eastAsia="맑은 고딕" w:hAnsi="맑은 고딕"/>
+        </w:rPr>
+        <w:t xml:space="preserve">환자 = 최종 지불 보증인</w:t>
+      </w:r>
+      <w:r>
+        <w:rPr>
+          <w:rFonts w:ascii="맑은 고딕" w:cs="맑은 고딕" w:eastAsia="맑은 고딕" w:hAnsi="맑은 고딕"/>
+        </w:rPr>
+        <w:t xml:space="preserve">: 환자가 </w:t>
+      </w:r>
+      <w:r>
+        <w:rPr>
+          <w:b/>
+          <w:bCs/>
+          <w:rFonts w:ascii="맑은 고딕" w:cs="맑은 고딕" w:eastAsia="맑은 고딕" w:hAnsi="맑은 고딕"/>
+        </w:rPr>
+        <w:t xml:space="preserve">재정책임 동의서(financial responsibility form)</w:t>
+      </w:r>
+      <w:r>
+        <w:rPr>
+          <w:rFonts w:ascii="맑은 고딕" w:cs="맑은 고딕" w:eastAsia="맑은 고딕" w:hAnsi="맑은 고딕"/>
+        </w:rPr>
+        <w:t xml:space="preserve"> 서명 — "보험사 미지급 시 본인 부담". 비보장분(자기부담·동반자·비보장 항목)은 </w:t>
+      </w:r>
+      <w:r>
+        <w:rPr>
+          <w:b/>
+          <w:bCs/>
+          <w:rFonts w:ascii="맑은 고딕" w:cs="맑은 고딕" w:eastAsia="맑은 고딕" w:hAnsi="맑은 고딕"/>
+        </w:rPr>
+        <w:t xml:space="preserve">환자 선수금/카드 등록</w:t>
+      </w:r>
+      <w:r>
+        <w:rPr>
+          <w:rFonts w:ascii="맑은 고딕" w:cs="맑은 고딕" w:eastAsia="맑은 고딕" w:hAnsi="맑은 고딕"/>
+        </w:rPr>
+        <w:t xml:space="preserve">. → 보험사가 딴소리해도 병원엔 지불 주체가 남음.</w:t>
+      </w:r>
+    </w:p>
+    <w:p>
+      <w:pPr>
+        <w:spacing w:after="20"/>
+      </w:pPr>
+      <w:r>
+        <w:rPr>
+          <w:rFonts w:ascii="맑은 고딕" w:cs="맑은 고딕" w:eastAsia="맑은 고딕" w:hAnsi="맑은 고딕"/>
+        </w:rPr>
+        <w:t xml:space="preserve">2. </w:t>
+      </w:r>
+      <w:r>
+        <w:rPr>
+          <w:b/>
+          <w:bCs/>
+          <w:rFonts w:ascii="맑은 고딕" w:cs="맑은 고딕" w:eastAsia="맑은 고딕" w:hAnsi="맑은 고딕"/>
+        </w:rPr>
+        <w:t xml:space="preserve">GOP는 "상세 승인서"로</w:t>
+      </w:r>
+      <w:r>
+        <w:rPr>
+          <w:rFonts w:ascii="맑은 고딕" w:cs="맑은 고딕" w:eastAsia="맑은 고딕" w:hAnsi="맑은 고딕"/>
+        </w:rPr>
+        <w:t xml:space="preserve">: 보장항목·상한액·유효기간·통화·제외항목·</w:t>
+      </w:r>
+      <w:r>
+        <w:rPr>
+          <w:b/>
+          <w:bCs/>
+          <w:rFonts w:ascii="맑은 고딕" w:cs="맑은 고딕" w:eastAsia="맑은 고딕" w:hAnsi="맑은 고딕"/>
+        </w:rPr>
+        <w:t xml:space="preserve">지불기한(net days)</w:t>
+      </w:r>
+      <w:r>
+        <w:rPr>
+          <w:rFonts w:ascii="맑은 고딕" w:cs="맑은 고딕" w:eastAsia="맑은 고딕" w:hAnsi="맑은 고딕"/>
+        </w:rPr>
+        <w:t xml:space="preserve">·청구처·사전승인 요건 명시. 모호한 한 줄 GOP 거절.</w:t>
+      </w:r>
+    </w:p>
+    <w:p>
+      <w:pPr>
+        <w:spacing w:after="20"/>
+      </w:pPr>
+      <w:r>
+        <w:rPr>
+          <w:rFonts w:ascii="맑은 고딕" w:cs="맑은 고딕" w:eastAsia="맑은 고딕" w:hAnsi="맑은 고딕"/>
+        </w:rPr>
+        <w:t xml:space="preserve">3. </w:t>
+      </w:r>
+      <w:r>
+        <w:rPr>
+          <w:b/>
+          <w:bCs/>
+          <w:rFonts w:ascii="맑은 고딕" w:cs="맑은 고딕" w:eastAsia="맑은 고딕" w:hAnsi="맑은 고딕"/>
+        </w:rPr>
+        <w:t xml:space="preserve">서면 사전승인(pre-auth) 후 집행</w:t>
+      </w:r>
+      <w:r>
+        <w:rPr>
+          <w:rFonts w:ascii="맑은 고딕" w:cs="맑은 고딕" w:eastAsia="맑은 고딕" w:hAnsi="맑은 고딕"/>
+        </w:rPr>
+        <w:t xml:space="preserve">: GOP 범위 밖(추가검사·합병증·업그레이드·동반자) = 별도 승인 or 환자 자비. "승인 안 한 항목" 거절 원천봉쇄.</w:t>
+      </w:r>
+    </w:p>
+    <w:p>
+      <w:pPr>
+        <w:spacing w:after="20"/>
+      </w:pPr>
+      <w:r>
+        <w:rPr>
+          <w:rFonts w:ascii="맑은 고딕" w:cs="맑은 고딕" w:eastAsia="맑은 고딕" w:hAnsi="맑은 고딕"/>
+        </w:rPr>
+        <w:t xml:space="preserve">4. </w:t>
+      </w:r>
+      <w:r>
+        <w:rPr>
+          <w:b/>
+          <w:bCs/>
+          <w:rFonts w:ascii="맑은 고딕" w:cs="맑은 고딕" w:eastAsia="맑은 고딕" w:hAnsi="맑은 고딕"/>
+        </w:rPr>
+        <w:t xml:space="preserve">고액치료 단계화</w:t>
+      </w:r>
+      <w:r>
+        <w:rPr>
+          <w:rFonts w:ascii="맑은 고딕" w:cs="맑은 고딕" w:eastAsia="맑은 고딕" w:hAnsi="맑은 고딕"/>
+        </w:rPr>
+        <w:t xml:space="preserve">: GOP 범위 확정 전 전체 고액 치료 선집행 금지(진단→승인확인→치료 게이트).</w:t>
+      </w:r>
+    </w:p>
+    <w:p>
+      <w:pPr>
+        <w:spacing w:after="20"/>
+      </w:pPr>
+      <w:r>
+        <w:rPr>
+          <w:rFonts w:ascii="맑은 고딕" w:cs="맑은 고딕" w:eastAsia="맑은 고딕" w:hAnsi="맑은 고딕"/>
+        </w:rPr>
+        <w:t xml:space="preserve">5. </w:t>
+      </w:r>
+      <w:r>
+        <w:rPr>
+          <w:b/>
+          <w:bCs/>
+          <w:rFonts w:ascii="맑은 고딕" w:cs="맑은 고딕" w:eastAsia="맑은 고딕" w:hAnsi="맑은 고딕"/>
+        </w:rPr>
+        <w:t xml:space="preserve">현금흐름 분리</w:t>
+      </w:r>
+      <w:r>
+        <w:rPr>
+          <w:rFonts w:ascii="맑은 고딕" w:cs="맑은 고딕" w:eastAsia="맑은 고딕" w:hAnsi="맑은 고딕"/>
+        </w:rPr>
+        <w:t xml:space="preserve">: 우리 유치수수료는 </w:t>
+      </w:r>
+      <w:r>
+        <w:rPr>
+          <w:b/>
+          <w:bCs/>
+          <w:rFonts w:ascii="맑은 고딕" w:cs="맑은 고딕" w:eastAsia="맑은 고딕" w:hAnsi="맑은 고딕"/>
+        </w:rPr>
+        <w:t xml:space="preserve">병원→본로이 B2B</w:t>
+      </w:r>
+      <w:r>
+        <w:rPr>
+          <w:rFonts w:ascii="맑은 고딕" w:cs="맑은 고딕" w:eastAsia="맑은 고딕" w:hAnsi="맑은 고딕"/>
+        </w:rPr>
+        <w:t xml:space="preserve">(보험사 정산 성패와 무관). 결제 허브=카자흐스탄. 보험사 지불 사이클(60~120일)에 우리 매출·병원 수납이 인질 안 되게.</w:t>
+      </w:r>
+    </w:p>
+    <w:p>
+      <w:pPr>
+        <w:spacing w:after="20"/>
+      </w:pPr>
+      <w:r>
+        <w:rPr>
+          <w:rFonts w:ascii="맑은 고딕" w:cs="맑은 고딕" w:eastAsia="맑은 고딕" w:hAnsi="맑은 고딕"/>
+        </w:rPr>
+        <w:t xml:space="preserve">6. </w:t>
+      </w:r>
+      <w:r>
+        <w:rPr>
+          <w:b/>
+          <w:bCs/>
+          <w:rFonts w:ascii="맑은 고딕" w:cs="맑은 고딕" w:eastAsia="맑은 고딕" w:hAnsi="맑은 고딕"/>
+        </w:rPr>
+        <w:t xml:space="preserve">부분지급·지연 대응 절차</w:t>
+      </w:r>
+      <w:r>
+        <w:rPr>
+          <w:rFonts w:ascii="맑은 고딕" w:cs="맑은 고딕" w:eastAsia="맑은 고딕" w:hAnsi="맑은 고딕"/>
+        </w:rPr>
+        <w:t xml:space="preserve">: 항목별 청구서+진료기록으로 근거 무장 → 에스컬레이션 연락처·기한 설정 → 미수금 aging 관리 → 기한 초과 시 </w:t>
+      </w:r>
+      <w:r>
+        <w:rPr>
+          <w:b/>
+          <w:bCs/>
+          <w:rFonts w:ascii="맑은 고딕" w:cs="맑은 고딕" w:eastAsia="맑은 고딕" w:hAnsi="맑은 고딕"/>
+        </w:rPr>
+        <w:t xml:space="preserve">환자 백스톱 발동</w:t>
+      </w:r>
+      <w:r>
+        <w:rPr>
+          <w:rFonts w:ascii="맑은 고딕" w:cs="맑은 고딕" w:eastAsia="맑은 고딕" w:hAnsi="맑은 고딕"/>
+        </w:rPr>
+        <w:t xml:space="preserve">.</w:t>
+      </w:r>
+    </w:p>
+    <w:p>
+      <w:pPr>
+        <w:spacing w:after="20"/>
+      </w:pPr>
+      <w:r>
+        <w:rPr>
+          <w:rFonts w:ascii="맑은 고딕" w:cs="맑은 고딕" w:eastAsia="맑은 고딕" w:hAnsi="맑은 고딕"/>
+        </w:rPr>
+        <w:t xml:space="preserve">7. </w:t>
+      </w:r>
+      <w:r>
+        <w:rPr>
+          <w:b/>
+          <w:bCs/>
+          <w:rFonts w:ascii="맑은 고딕" w:cs="맑은 고딕" w:eastAsia="맑은 고딕" w:hAnsi="맑은 고딕"/>
+        </w:rPr>
+        <w:t xml:space="preserve">보험사 신뢰 등급 + 파일럿</w:t>
+      </w:r>
+      <w:r>
+        <w:rPr>
+          <w:rFonts w:ascii="맑은 고딕" w:cs="맑은 고딕" w:eastAsia="맑은 고딕" w:hAnsi="맑은 고딕"/>
+        </w:rPr>
+        <w:t xml:space="preserve">: 신규 보험사는 소액/단순 케이스로 지불 행태 관찰 → 검증 시 완화, 상습 지연 시 조건 강화·거래 중단.</w:t>
+      </w:r>
+    </w:p>
+    <w:p>
+      <w:pPr>
+        <w:spacing w:after="20"/>
+      </w:pPr>
+      <w:r>
+        <w:rPr>
+          <w:rFonts w:ascii="맑은 고딕" w:cs="맑은 고딕" w:eastAsia="맑은 고딕" w:hAnsi="맑은 고딕"/>
+        </w:rPr>
+        <w:t xml:space="preserve">8. </w:t>
+      </w:r>
+      <w:r>
+        <w:rPr>
+          <w:b/>
+          <w:bCs/>
+          <w:rFonts w:ascii="맑은 고딕" w:cs="맑은 고딕" w:eastAsia="맑은 고딕" w:hAnsi="맑은 고딕"/>
+        </w:rPr>
+        <w:t xml:space="preserve">🔴 이대서울병원 국제의료사업팀 프로세스에 정렬</w:t>
+      </w:r>
+      <w:r>
+        <w:rPr>
+          <w:rFonts w:ascii="맑은 고딕" w:cs="맑은 고딕" w:eastAsia="맑은 고딕" w:hAnsi="맑은 고딕"/>
+        </w:rPr>
+        <w:t xml:space="preserve">: 대학병원 IPD는 외국 보험사 GOP 청구를 이미 수행 → 그들의 검증된 청구·정산·클레임 SOP를 배우고 우리 절차를 거기 맞춘다(2026-07-15 미팅이 그 시작). </w:t>
+      </w:r>
+      <w:r>
+        <w:rPr>
+          <w:b/>
+          <w:bCs/>
+          <w:rFonts w:ascii="맑은 고딕" w:cs="맑은 고딕" w:eastAsia="맑은 고딕" w:hAnsi="맑은 고딕"/>
+        </w:rPr>
+        <w:t xml:space="preserve">🔴 재정책임 동의서 양식·GOP 체크리스트를 이대서울 IPD 것 기반으로 확보.</w:t>
+      </w:r>
+    </w:p>
+    <w:p>
+      <w:pPr>
+        <w:spacing w:after="20"/>
+      </w:pPr>
+      <w:r>
+        <w:rPr>
+          <w:rFonts w:ascii="맑은 고딕" w:cs="맑은 고딕" w:eastAsia="맑은 고딕" w:hAnsi="맑은 고딕"/>
+        </w:rPr>
+        <w:t xml:space="preserve">9. </w:t>
+      </w:r>
+      <w:r>
+        <w:rPr>
+          <w:b/>
+          <w:bCs/>
+          <w:rFonts w:ascii="맑은 고딕" w:cs="맑은 고딕" w:eastAsia="맑은 고딕" w:hAnsi="맑은 고딕"/>
+        </w:rPr>
+        <w:t xml:space="preserve">계약 정산 조항</w:t>
+      </w:r>
+      <w:r>
+        <w:rPr>
+          <w:rFonts w:ascii="맑은 고딕" w:cs="맑은 고딕" w:eastAsia="맑은 고딕" w:hAnsi="맑은 고딕"/>
+        </w:rPr>
+        <w:t xml:space="preserve">: 보험사/어시스턴스 계약에 지불기한·통화·분쟁해결·지연이자·"치료범위=GOP범위" 명문화(→ docs/marketing/*-partnership-agreement-draft.md에 반영).</w:t>
+      </w:r>
+    </w:p>
+    <w:p>
+      <w:pPr>
+        <w:spacing w:after="40"/>
+      </w:pPr>
+    </w:p>
+    <w:p>
+      <w:pPr>
         <w:pBdr>
           <w:bottom w:val="single" w:color="CCCCCC" w:sz="6"/>
         </w:pBdr>
@@ -9342,13 +9753,13 @@
           <w:bCs/>
           <w:rFonts w:ascii="맑은 고딕" w:cs="맑은 고딕" w:eastAsia="맑은 고딕" w:hAnsi="맑은 고딕"/>
         </w:rPr>
-        <w:t xml:space="preserve">면력 담당자 8창구 지정(§4)</w:t>
-      </w:r>
-      <w:r>
-        <w:rPr>
-          <w:rFonts w:ascii="맑은 고딕" w:cs="맑은 고딕" w:eastAsia="맑은 고딕" w:hAnsi="맑은 고딕"/>
-        </w:rPr>
-        <w:t xml:space="preserve"> — 대표원장님과 이 문서 함께 보며 그 자리에서 기입.</w:t>
+        <w:t xml:space="preserve">보험사 GOP 리스크(§6.10)</w:t>
+      </w:r>
+      <w:r>
+        <w:rPr>
+          <w:rFonts w:ascii="맑은 고딕" w:cs="맑은 고딕" w:eastAsia="맑은 고딕" w:hAnsi="맑은 고딕"/>
+        </w:rPr>
+        <w:t xml:space="preserve">: 환자 재정책임 동의서 도입 · GOP 상세 체크리스트 · 이대서울 IPD 정산 프로세스 정렬.</w:t>
       </w:r>
     </w:p>
     <w:p>
@@ -9372,27 +9783,13 @@
           <w:bCs/>
           <w:rFonts w:ascii="맑은 고딕" w:cs="맑은 고딕" w:eastAsia="맑은 고딕" w:hAnsi="맑은 고딕"/>
         </w:rPr>
-        <w:t xml:space="preserve">응급 당직 연락·에스컬레이션(§6.1)</w:t>
-      </w:r>
-      <w:r>
-        <w:rPr>
-          <w:rFonts w:ascii="맑은 고딕" w:cs="맑은 고딕" w:eastAsia="맑은 고딕" w:hAnsi="맑은 고딕"/>
-        </w:rPr>
-        <w:t xml:space="preserve"> + </w:t>
-      </w:r>
-      <w:r>
-        <w:rPr>
-          <w:b/>
-          <w:bCs/>
-          <w:rFonts w:ascii="맑은 고딕" w:cs="맑은 고딕" w:eastAsia="맑은 고딕" w:hAnsi="맑은 고딕"/>
-        </w:rPr>
-        <w:t xml:space="preserve">수용/거절 판정 기준(§6.2)</w:t>
-      </w:r>
-      <w:r>
-        <w:rPr>
-          <w:rFonts w:ascii="맑은 고딕" w:cs="맑은 고딕" w:eastAsia="맑은 고딕" w:hAnsi="맑은 고딕"/>
-        </w:rPr>
-        <w:t xml:space="preserve"> — 안전 최우선, 원장 협의.</w:t>
+        <w:t xml:space="preserve">면력 담당자 8창구 지정(§4)</w:t>
+      </w:r>
+      <w:r>
+        <w:rPr>
+          <w:rFonts w:ascii="맑은 고딕" w:cs="맑은 고딕" w:eastAsia="맑은 고딕" w:hAnsi="맑은 고딕"/>
+        </w:rPr>
+        <w:t xml:space="preserve"> — 대표원장님과 이 문서 함께 보며 그 자리에서 기입.</w:t>
       </w:r>
     </w:p>
     <w:p>
@@ -9416,13 +9813,13 @@
           <w:bCs/>
           <w:rFonts w:ascii="맑은 고딕" w:cs="맑은 고딕" w:eastAsia="맑은 고딕" w:hAnsi="맑은 고딕"/>
         </w:rPr>
-        <w:t xml:space="preserve">보증금·노쇼 규칙(§6.3)</w:t>
-      </w:r>
-      <w:r>
-        <w:rPr>
-          <w:rFonts w:ascii="맑은 고딕" w:cs="맑은 고딕" w:eastAsia="맑은 고딕" w:hAnsi="맑은 고딕"/>
-        </w:rPr>
-        <w:t xml:space="preserve"> · </w:t>
+        <w:t xml:space="preserve">응급 당직 연락·에스컬레이션(§6.1)</w:t>
+      </w:r>
+      <w:r>
+        <w:rPr>
+          <w:rFonts w:ascii="맑은 고딕" w:cs="맑은 고딕" w:eastAsia="맑은 고딕" w:hAnsi="맑은 고딕"/>
+        </w:rPr>
+        <w:t xml:space="preserve"> + </w:t>
       </w:r>
       <w:r>
         <w:rPr>
@@ -9430,27 +9827,13 @@
           <w:bCs/>
           <w:rFonts w:ascii="맑은 고딕" w:cs="맑은 고딕" w:eastAsia="맑은 고딕" w:hAnsi="맑은 고딕"/>
         </w:rPr>
-        <w:t xml:space="preserve">국외이전 동의 주체·양식(§6.4)</w:t>
-      </w:r>
-      <w:r>
-        <w:rPr>
-          <w:rFonts w:ascii="맑은 고딕" w:cs="맑은 고딕" w:eastAsia="맑은 고딕" w:hAnsi="맑은 고딕"/>
-        </w:rPr>
-        <w:t xml:space="preserve"> · </w:t>
-      </w:r>
-      <w:r>
-        <w:rPr>
-          <w:b/>
-          <w:bCs/>
-          <w:rFonts w:ascii="맑은 고딕" w:cs="맑은 고딕" w:eastAsia="맑은 고딕" w:hAnsi="맑은 고딕"/>
-        </w:rPr>
-        <w:t xml:space="preserve">할랄 대응 범위(§6.5)</w:t>
-      </w:r>
-      <w:r>
-        <w:rPr>
-          <w:rFonts w:ascii="맑은 고딕" w:cs="맑은 고딕" w:eastAsia="맑은 고딕" w:hAnsi="맑은 고딕"/>
-        </w:rPr>
-        <w:t xml:space="preserve">.</w:t>
+        <w:t xml:space="preserve">수용/거절 판정 기준(§6.2)</w:t>
+      </w:r>
+      <w:r>
+        <w:rPr>
+          <w:rFonts w:ascii="맑은 고딕" w:cs="맑은 고딕" w:eastAsia="맑은 고딕" w:hAnsi="맑은 고딕"/>
+        </w:rPr>
+        <w:t xml:space="preserve"> — 안전 최우선, 원장 협의.</w:t>
       </w:r>
     </w:p>
     <w:p>
@@ -9466,7 +9849,7 @@
         <w:rPr>
           <w:rFonts w:ascii="맑은 고딕" w:cs="맑은 고딕" w:eastAsia="맑은 고딕" w:hAnsi="맑은 고딕"/>
         </w:rPr>
-        <w:t xml:space="preserve">✅ </w:t>
+        <w:t xml:space="preserve">🔴 </w:t>
       </w:r>
       <w:r>
         <w:rPr>
@@ -9474,13 +9857,41 @@
           <w:bCs/>
           <w:rFonts w:ascii="맑은 고딕" w:cs="맑은 고딕" w:eastAsia="맑은 고딕" w:hAnsi="맑은 고딕"/>
         </w:rPr>
-        <w:t xml:space="preserve">항공·숙소 예약 = 케바케</w:t>
-      </w:r>
-      <w:r>
-        <w:rPr>
-          <w:rFonts w:ascii="맑은 고딕" w:cs="맑은 고딕" w:eastAsia="맑은 고딕" w:hAnsi="맑은 고딕"/>
-        </w:rPr>
-        <w:t xml:space="preserve">(§0.5) — 케이스 접수 때 예약 주체(환자/에이전시/보험사/우리)를 그때그때 확정.</w:t>
+        <w:t xml:space="preserve">보증금·노쇼 규칙(§6.3)</w:t>
+      </w:r>
+      <w:r>
+        <w:rPr>
+          <w:rFonts w:ascii="맑은 고딕" w:cs="맑은 고딕" w:eastAsia="맑은 고딕" w:hAnsi="맑은 고딕"/>
+        </w:rPr>
+        <w:t xml:space="preserve"> · </w:t>
+      </w:r>
+      <w:r>
+        <w:rPr>
+          <w:b/>
+          <w:bCs/>
+          <w:rFonts w:ascii="맑은 고딕" w:cs="맑은 고딕" w:eastAsia="맑은 고딕" w:hAnsi="맑은 고딕"/>
+        </w:rPr>
+        <w:t xml:space="preserve">국외이전 동의 주체·양식(§6.4)</w:t>
+      </w:r>
+      <w:r>
+        <w:rPr>
+          <w:rFonts w:ascii="맑은 고딕" w:cs="맑은 고딕" w:eastAsia="맑은 고딕" w:hAnsi="맑은 고딕"/>
+        </w:rPr>
+        <w:t xml:space="preserve"> · </w:t>
+      </w:r>
+      <w:r>
+        <w:rPr>
+          <w:b/>
+          <w:bCs/>
+          <w:rFonts w:ascii="맑은 고딕" w:cs="맑은 고딕" w:eastAsia="맑은 고딕" w:hAnsi="맑은 고딕"/>
+        </w:rPr>
+        <w:t xml:space="preserve">할랄 대응 범위(§6.5)</w:t>
+      </w:r>
+      <w:r>
+        <w:rPr>
+          <w:rFonts w:ascii="맑은 고딕" w:cs="맑은 고딕" w:eastAsia="맑은 고딕" w:hAnsi="맑은 고딕"/>
+        </w:rPr>
+        <w:t xml:space="preserve">.</w:t>
       </w:r>
     </w:p>
     <w:p>
@@ -9496,7 +9907,7 @@
         <w:rPr>
           <w:rFonts w:ascii="맑은 고딕" w:cs="맑은 고딕" w:eastAsia="맑은 고딕" w:hAnsi="맑은 고딕"/>
         </w:rPr>
-        <w:t xml:space="preserve">🔴 </w:t>
+        <w:t xml:space="preserve">✅ </w:t>
       </w:r>
       <w:r>
         <w:rPr>
@@ -9504,13 +9915,13 @@
           <w:bCs/>
           <w:rFonts w:ascii="맑은 고딕" w:cs="맑은 고딕" w:eastAsia="맑은 고딕" w:hAnsi="맑은 고딕"/>
         </w:rPr>
-        <w:t xml:space="preserve">보험사 경유 시 수수료 회수 경로</w:t>
-      </w:r>
-      <w:r>
-        <w:rPr>
-          <w:rFonts w:ascii="맑은 고딕" w:cs="맑은 고딕" w:eastAsia="맑은 고딕" w:hAnsi="맑은 고딕"/>
-        </w:rPr>
-        <w:t xml:space="preserve">(§3-C).</w:t>
+        <w:t xml:space="preserve">항공·숙소 예약 = 케바케</w:t>
+      </w:r>
+      <w:r>
+        <w:rPr>
+          <w:rFonts w:ascii="맑은 고딕" w:cs="맑은 고딕" w:eastAsia="맑은 고딕" w:hAnsi="맑은 고딕"/>
+        </w:rPr>
+        <w:t xml:space="preserve">(§0.5) — 케이스 접수 때 예약 주체(환자/에이전시/보험사/우리)를 그때그때 확정.</w:t>
       </w:r>
     </w:p>
     <w:p>
@@ -9526,7 +9937,7 @@
         <w:rPr>
           <w:rFonts w:ascii="맑은 고딕" w:cs="맑은 고딕" w:eastAsia="맑은 고딕" w:hAnsi="맑은 고딕"/>
         </w:rPr>
-        <w:t xml:space="preserve">✅ </w:t>
+        <w:t xml:space="preserve">🔴 </w:t>
       </w:r>
       <w:r>
         <w:rPr>
@@ -9534,13 +9945,13 @@
           <w:bCs/>
           <w:rFonts w:ascii="맑은 고딕" w:cs="맑은 고딕" w:eastAsia="맑은 고딕" w:hAnsi="맑은 고딕"/>
         </w:rPr>
-        <w:t xml:space="preserve">코디네이터 실재</w:t>
-      </w:r>
-      <w:r>
-        <w:rPr>
-          <w:rFonts w:ascii="맑은 고딕" w:cs="맑은 고딕" w:eastAsia="맑은 고딕" w:hAnsi="맑은 고딕"/>
-        </w:rPr>
-        <w:t xml:space="preserve"> — 🟡 명단·동시 케이스 수·백업 인력만 v1에서.</w:t>
+        <w:t xml:space="preserve">보험사 경유 시 수수료 회수 경로</w:t>
+      </w:r>
+      <w:r>
+        <w:rPr>
+          <w:rFonts w:ascii="맑은 고딕" w:cs="맑은 고딕" w:eastAsia="맑은 고딕" w:hAnsi="맑은 고딕"/>
+        </w:rPr>
+        <w:t xml:space="preserve">(§3-C).</w:t>
       </w:r>
     </w:p>
     <w:p>
@@ -9556,7 +9967,7 @@
         <w:rPr>
           <w:rFonts w:ascii="맑은 고딕" w:cs="맑은 고딕" w:eastAsia="맑은 고딕" w:hAnsi="맑은 고딕"/>
         </w:rPr>
-        <w:t xml:space="preserve">🔴 </w:t>
+        <w:t xml:space="preserve">✅ </w:t>
       </w:r>
       <w:r>
         <w:rPr>
@@ -9564,13 +9975,13 @@
           <w:bCs/>
           <w:rFonts w:ascii="맑은 고딕" w:cs="맑은 고딕" w:eastAsia="맑은 고딕" w:hAnsi="맑은 고딕"/>
         </w:rPr>
-        <w:t xml:space="preserve">리드타임·병원 영업시간 내 SLA</w:t>
-      </w:r>
-      <w:r>
-        <w:rPr>
-          <w:rFonts w:ascii="맑은 고딕" w:cs="맑은 고딕" w:eastAsia="맑은 고딕" w:hAnsi="맑은 고딕"/>
-        </w:rPr>
-        <w:t xml:space="preserve"> 확정(§4 제안값 검토).</w:t>
+        <w:t xml:space="preserve">코디네이터 실재</w:t>
+      </w:r>
+      <w:r>
+        <w:rPr>
+          <w:rFonts w:ascii="맑은 고딕" w:cs="맑은 고딕" w:eastAsia="맑은 고딕" w:hAnsi="맑은 고딕"/>
+        </w:rPr>
+        <w:t xml:space="preserve"> — 🟡 명단·동시 케이스 수·백업 인력만 v1에서.</w:t>
       </w:r>
     </w:p>
     <w:p>
@@ -9586,6 +9997,36 @@
         <w:rPr>
           <w:rFonts w:ascii="맑은 고딕" w:cs="맑은 고딕" w:eastAsia="맑은 고딕" w:hAnsi="맑은 고딕"/>
         </w:rPr>
+        <w:t xml:space="preserve">🔴 </w:t>
+      </w:r>
+      <w:r>
+        <w:rPr>
+          <w:b/>
+          <w:bCs/>
+          <w:rFonts w:ascii="맑은 고딕" w:cs="맑은 고딕" w:eastAsia="맑은 고딕" w:hAnsi="맑은 고딕"/>
+        </w:rPr>
+        <w:t xml:space="preserve">리드타임·병원 영업시간 내 SLA</w:t>
+      </w:r>
+      <w:r>
+        <w:rPr>
+          <w:rFonts w:ascii="맑은 고딕" w:cs="맑은 고딕" w:eastAsia="맑은 고딕" w:hAnsi="맑은 고딕"/>
+        </w:rPr>
+        <w:t xml:space="preserve"> 확정(§4 제안값 검토).</w:t>
+      </w:r>
+    </w:p>
+    <w:p>
+      <w:pPr>
+        <w:pStyle w:val="ListParagraph"/>
+        <w:numPr>
+          <w:ilvl w:val="0"/>
+          <w:numId w:val="1"/>
+        </w:numPr>
+        <w:spacing w:after="20"/>
+      </w:pPr>
+      <w:r>
+        <w:rPr>
+          <w:rFonts w:ascii="맑은 고딕" w:cs="맑은 고딕" w:eastAsia="맑은 고딕" w:hAnsi="맑은 고딕"/>
+        </w:rPr>
         <w:t xml:space="preserve">🟡 </w:t>
       </w:r>
       <w:r>
@@ -9631,6 +10072,36 @@
           <w:rFonts w:ascii="맑은 고딕" w:cs="맑은 고딕" w:eastAsia="맑은 고딕" w:hAnsi="맑은 고딕"/>
         </w:rPr>
         <w:t xml:space="preserve">변경 이력</w:t>
+      </w:r>
+    </w:p>
+    <w:p>
+      <w:pPr>
+        <w:pStyle w:val="ListParagraph"/>
+        <w:numPr>
+          <w:ilvl w:val="0"/>
+          <w:numId w:val="1"/>
+        </w:numPr>
+        <w:spacing w:after="20"/>
+      </w:pPr>
+      <w:r>
+        <w:rPr>
+          <w:rFonts w:ascii="맑은 고딕" w:cs="맑은 고딕" w:eastAsia="맑은 고딕" w:hAnsi="맑은 고딕"/>
+        </w:rPr>
+        <w:t xml:space="preserve">2026-07-15 (v0.4, 보험사 정산 리스크): 이대서울병원 국제의료사업팀 미팅 후 PO 제기 — </w:t>
+      </w:r>
+      <w:r>
+        <w:rPr>
+          <w:b/>
+          <w:bCs/>
+          <w:rFonts w:ascii="맑은 고딕" w:cs="맑은 고딕" w:eastAsia="맑은 고딕" w:hAnsi="맑은 고딕"/>
+        </w:rPr>
+        <w:t xml:space="preserve">보험사가 GOP 보내놓고 정산 지연·부분지급</w:t>
+      </w:r>
+      <w:r>
+        <w:rPr>
+          <w:rFonts w:ascii="맑은 고딕" w:cs="맑은 고딕" w:eastAsia="맑은 고딕" w:hAnsi="맑은 고딕"/>
+        </w:rPr>
+        <w:t xml:space="preserve">하는 리스크. §6.10 신설: 환자 재정책임 백스톱 / GOP 상세화 / 사전승인 / 고액 단계화 / 현금흐름 분리 / 부분지급 대응 / 신뢰등급·파일럿 / 이대서울 IPD 프로세스 정렬 / 계약 정산조항. 병원 대납 약속 금지 원칙 명시.</w:t>
       </w:r>
     </w:p>
     <w:p>

</xml_diff>